<commit_message>
docs: fiche Andre v2 - lot Zymo resolu (date + V4 identique), ENA hors perimetre, ajout section divergences draft/donnees a confirmer
</commit_message>
<xml_diff>
--- a/docs/demande_complements_andre.docx
+++ b/docs/demande_complements_andre.docx
@@ -16,7 +16,7 @@
           <w:b w:val="0"/>
           <w:i/>
         </w:rPr>
-        <w:t>Projet microbiome-hybrid (16S, hotu × toxostome). Informations de paillasse manquantes pour finaliser la section Matériel &amp; Méthodes du manuscrit.</w:t>
+        <w:t>Projet microbiome-hybrid (16S, hotu × toxostome). Mise à jour du 2026-08-22.</w:t>
       </w:r>
     </w:p>
     <w:p>
@@ -25,7 +25,7 @@
           <w:b w:val="0"/>
           <w:i/>
         </w:rPr>
-        <w:t>Le pipeline bioinformatique est complet et documenté ; les points ci-dessous ne peuvent venir que du cahier de laboratoire ou de la plateforme de séquençage.</w:t>
+        <w:t>Le pipeline bioinformatique est complet et la section M&amp;M rédigée jusqu'à la préparation des données. Les points ci-dessous ne peuvent venir que du cahier de laboratoire ou de la plateforme.</w:t>
       </w:r>
     </w:p>
     <w:p>
@@ -44,7 +44,7 @@
         <w:rPr>
           <w:b w:val="0"/>
         </w:rPr>
-        <w:t>Dates précises de collecte (par site et par année 2014 / 2015).</w:t>
+        <w:t>Dates précises de collecte, par site et par année (2014 / 2015).</w:t>
       </w:r>
     </w:p>
     <w:p>
@@ -66,7 +66,7 @@
         <w:rPr>
           <w:b w:val="0"/>
         </w:rPr>
-        <w:t>Méthode et autorisations : confirmer que la pêche électrique et les autorisations n° 2014-156-0001 et n° 2015-1426DDT605 (reprises du manuscrit d'origine) s'appliquent bien au lot Durance.</w:t>
+        <w:t>Confirmer que la pêche électrique et les autorisations n° 2014-156-0001 et n° 2015-1426DDT605 (reprises du manuscrit d'origine) s'appliquent bien au lot Durance.</w:t>
       </w:r>
     </w:p>
     <w:p>
@@ -75,7 +75,7 @@
           <w:b w:val="0"/>
           <w:i/>
         </w:rPr>
-        <w:t>Note : les effectifs séquencés sont connus (181 individus). Restent à statuer le rôle de Manosque et l'identité de Per — liés au génotypage en cours.</w:t>
+        <w:t>Note : les effectifs sont connus (181 individus). Le rôle de Manosque et l'identité de Per restent liés au génotypage en cours — demande séparée.</w:t>
       </w:r>
     </w:p>
     <w:p>
@@ -83,7 +83,29 @@
         <w:pStyle w:val="Heading1"/>
       </w:pPr>
       <w:r>
-        <w:t>2 — PCR et séquençage (§3 du M&amp;M)</w:t>
+        <w:t>2 — Séquençage (§3 du M&amp;M)</w:t>
+      </w:r>
+    </w:p>
+    <w:p>
+      <w:pPr>
+        <w:pStyle w:val="ListBullet"/>
+      </w:pPr>
+      <w:r>
+        <w:rPr>
+          <w:b/>
+        </w:rPr>
+        <w:t>Dates des trois runs MiSeq (durance1, durance2, durance3).</w:t>
+      </w:r>
+    </w:p>
+    <w:p>
+      <w:pPr>
+        <w:pStyle w:val="ListBullet"/>
+      </w:pPr>
+      <w:r>
+        <w:rPr>
+          <w:b/>
+        </w:rPr>
+        <w:t>Taux de spike-in PhiX.</w:t>
       </w:r>
     </w:p>
     <w:p>
@@ -94,7 +116,15 @@
         <w:rPr>
           <w:b w:val="0"/>
         </w:rPr>
-        <w:t>Nombre exact de cycles PCR.</w:t>
+        <w:t>Optionnel : nombre de cycles PCR et polymérase. Le M&amp;M cite actuellement Galan et al. (2016) pour les conditions d'amplification, ce qui suffit à la plupart des journaux ; ces valeurs ne sont nécessaires que si le journal exige les paramètres explicites.</w:t>
+      </w:r>
+    </w:p>
+    <w:p>
+      <w:pPr>
+        <w:pStyle w:val="Heading1"/>
+      </w:pPr>
+      <w:r>
+        <w:t>3 — Standard Zymo (§4 du M&amp;M)</w:t>
       </w:r>
     </w:p>
     <w:p>
@@ -105,7 +135,34 @@
         <w:rPr>
           <w:b w:val="0"/>
         </w:rPr>
-        <w:t>Polymérase utilisée (nom commercial et fournisseur).</w:t>
+        <w:t>Référence catalogue du standard ZymoBIOMICS utilisé (D6300 ou D6305 ?).</w:t>
+      </w:r>
+    </w:p>
+    <w:p>
+      <w:r>
+        <w:rPr>
+          <w:b w:val="0"/>
+          <w:i w:val="0"/>
+          <w:color w:val="1F4E79"/>
+        </w:rPr>
+        <w:t>Le numéro de lot n'est plus nécessaire : la date de manipulation (2014-2015) est antérieure au lot ZRC190633 à partir duquel Zymo a changé 5 souches, ce qui fixe le jeu de souches de référence. Nous avons de plus vérifié que, sur la région V4 amplifiée, les séquences 16S des deux jeux de référence sont identiques pour les 8 espèces — la validation 8/8 des mocks est donc indépendante du lot.</w:t>
+      </w:r>
+    </w:p>
+    <w:p>
+      <w:pPr>
+        <w:pStyle w:val="Heading1"/>
+      </w:pPr>
+      <w:r>
+        <w:t>4 — Divergences draft / données : confirmation demandée</w:t>
+      </w:r>
+    </w:p>
+    <w:p>
+      <w:r>
+        <w:rPr>
+          <w:b w:val="0"/>
+          <w:i/>
+        </w:rPr>
+        <w:t>Trois points où le draft du manuscrit d'origine diffère du jeu Durance. Nous avons retenu les données Durance ; merci de confirmer.</w:t>
       </w:r>
     </w:p>
     <w:p>
@@ -116,7 +173,7 @@
         <w:rPr>
           <w:b w:val="0"/>
         </w:rPr>
-        <w:t>Dates des trois runs MiSeq (durance1, durance2, durance3).</w:t>
+        <w:t>Tissus : le draft mentionne une extraction sur branchie et midgut ; le jeu Durance comporte quatre tissus (nageoire caudale, branchie, midgut, hindgut).</w:t>
       </w:r>
     </w:p>
     <w:p>
@@ -127,53 +184,7 @@
         <w:rPr>
           <w:b w:val="0"/>
         </w:rPr>
-        <w:t>Taux de spike-in PhiX.</w:t>
-      </w:r>
-    </w:p>
-    <w:p>
-      <w:pPr>
-        <w:pStyle w:val="Heading1"/>
-      </w:pPr>
-      <w:r>
-        <w:t>3 — Contrôles : standard Zymo (§4 et §7 du M&amp;M) — POINT PRIORITAIRE</w:t>
-      </w:r>
-    </w:p>
-    <w:p>
-      <w:r>
-        <w:rPr>
-          <w:b/>
-          <w:i w:val="0"/>
-          <w:color w:val="C0392B"/>
-        </w:rPr>
-        <w:t>Référence catalogue ET numéro de lot exact du standard ZymoBIOMICS utilisé.</w:t>
-      </w:r>
-    </w:p>
-    <w:p>
-      <w:r>
-        <w:rPr>
-          <w:b w:val="0"/>
-          <w:i w:val="0"/>
-        </w:rPr>
-        <w:t>Pourquoi c'est nécessaire — et pourquoi nos données ne peuvent pas y répondre :</w:t>
-      </w:r>
-    </w:p>
-    <w:p>
-      <w:r>
-        <w:rPr>
-          <w:b w:val="0"/>
-          <w:i w:val="0"/>
-        </w:rPr>
-        <w:t>Zymo a modifié 5 souches de son standard à partir du lot ZRC190633. Il existe donc deux jeux de génomes de référence. Nous avons validé les mocks contre le jeu « ancien lot » (cohérent avec un séquençage 2014-2015) : les 8 espèces attendues sont retrouvées à 100 % d'identité, sans ASV parasite.</w:t>
-      </w:r>
-    </w:p>
-    <w:p>
-      <w:r>
-        <w:rPr>
-          <w:b w:val="0"/>
-          <w:i w:val="0"/>
-          <w:color w:val="1F4E79"/>
-        </w:rPr>
-        <w:t>Cependant, nous avons vérifié que ce résultat ne permet PAS de confirmer le lot : sur la région V4 amplifiée, les séquences des deux jeux de référence sont identiques pour les 8 espèces — y compris pour Enterococcus faecalis et Staphylococcus aureus, dont les 16S complets diffèrent pourtant entre lots. Le désaccord était donc impossible à détecter avec nos données ; seul le numéro de lot permet de verrouiller le jeu de souches cité dans le manuscrit.</w:t>
+        <w:t>Runs : le draft décrit une procédure « dupliquée, et l'une séquencée deux fois » ; les données montrent trois runs des mêmes 768 librairies (triplicats techniques).</w:t>
       </w:r>
     </w:p>
     <w:p>
@@ -184,7 +195,7 @@
         <w:rPr>
           <w:b w:val="0"/>
         </w:rPr>
-        <w:t>Répartition précise des contrôles négatifs : combien de blancs d'extraction et combien de contrôles PCR (no-template) ont été préparés, et selon quel plan ? (Nous observons 4 blancs d'extraction — un par tissu — et 8 témoins PCR, chacun présent dans les 3 runs.)</w:t>
+        <w:t>Taxonomie : le draft cite SILVA v132 via le classifieur bayésien de QIIME 2 ; le pipeline Durance utilise SILVA v138.2 via assignTaxonomy (DADA2). Le M&amp;M décrit le pipeline réellement exécuté.</w:t>
       </w:r>
     </w:p>
     <w:p>
@@ -192,48 +203,7 @@
         <w:pStyle w:val="Heading1"/>
       </w:pPr>
       <w:r>
-        <w:t>4 — Dépôt des données (§9 du M&amp;M)</w:t>
-      </w:r>
-    </w:p>
-    <w:p>
-      <w:pPr>
-        <w:pStyle w:val="ListBullet"/>
-      </w:pPr>
-      <w:r>
-        <w:rPr>
-          <w:b w:val="0"/>
-        </w:rPr>
-        <w:t>Les lectures brutes ont-elles déjà été déposées (SRA / ENA) ? Si oui, numéro d'accession.</w:t>
-      </w:r>
-    </w:p>
-    <w:p>
-      <w:pPr>
-        <w:pStyle w:val="ListBullet"/>
-      </w:pPr>
-      <w:r>
-        <w:rPr>
-          <w:b w:val="0"/>
-        </w:rPr>
-        <w:t>Si non : qui pilote le dépôt, et sous quel BioProject ?</w:t>
-      </w:r>
-    </w:p>
-    <w:p>
-      <w:pPr>
-        <w:pStyle w:val="ListBullet"/>
-      </w:pPr>
-      <w:r>
-        <w:rPr>
-          <w:b w:val="0"/>
-        </w:rPr>
-        <w:t>Métadonnées au format MIxS : existent-elles déjà pour ce jeu ?</w:t>
-      </w:r>
-    </w:p>
-    <w:p>
-      <w:pPr>
-        <w:pStyle w:val="Heading1"/>
-      </w:pPr>
-      <w:r>
-        <w:t>Rappel — ce qui n'est PAS demandé ici</w:t>
+        <w:t>Hors périmètre de cette fiche</w:t>
       </w:r>
     </w:p>
     <w:p>
@@ -242,7 +212,11 @@
           <w:b w:val="0"/>
           <w:i/>
         </w:rPr>
-        <w:t>Le génotypage / index hybride fait l'objet d'une demande séparée (fichier metadata/index_hybride_andre.csv, 181 individus, 132 à renseigner). Le mode d'application de la raréfaction est une décision d'analyse interne, pas une donnée de paillasse.</w:t>
+        <w:t>• Génotypage / index hybride : demande séparée (metadata/index_hybride_andre.csv, 181 individus, 132 à renseigner).</w:t>
+        <w:br/>
+        <w:t>• Dépôt ENA des lectures brutes : pris en charge par JF Martin, à voir ultérieurement.</w:t>
+        <w:br/>
+        <w:t>• Mode d'application de la raréfaction : décision d'analyse interne, pas une donnée de paillasse.</w:t>
       </w:r>
     </w:p>
     <w:sectPr>

</xml_diff>

<commit_message>
docs: fiche Andre v3 - un seul point ouvert (dates+coordonnees collecte) ; reponses integrees ; note sur la marge de la justification du lot Zymo
</commit_message>
<xml_diff>
--- a/docs/demande_complements_andre.docx
+++ b/docs/demande_complements_andre.docx
@@ -25,7 +25,7 @@
           <w:b w:val="0"/>
           <w:i/>
         </w:rPr>
-        <w:t>Le pipeline bioinformatique est complet et la section M&amp;M rédigée jusqu'à la préparation des données. Les points ci-dessous ne peuvent venir que du cahier de laboratoire ou de la plateforme.</w:t>
+        <w:t>La section M&amp;M est rédigée jusqu'à la préparation des données. Après les réponses reçues, il ne reste qu'un seul point de paillasse ouvert.</w:t>
       </w:r>
     </w:p>
     <w:p>
@@ -33,7 +33,7 @@
         <w:pStyle w:val="Heading1"/>
       </w:pPr>
       <w:r>
-        <w:t>1 — Échantillonnage (§1 du M&amp;M)</w:t>
+        <w:t>SEUL POINT OUVERT — Échantillonnage (§1 du M&amp;M)</w:t>
       </w:r>
     </w:p>
     <w:p>
@@ -42,7 +42,7 @@
       </w:pPr>
       <w:r>
         <w:rPr>
-          <w:b w:val="0"/>
+          <w:b/>
         </w:rPr>
         <w:t>Dates précises de collecte, par site et par année (2014 / 2015).</w:t>
       </w:r>
@@ -53,7 +53,7 @@
       </w:pPr>
       <w:r>
         <w:rPr>
-          <w:b w:val="0"/>
+          <w:b/>
         </w:rPr>
         <w:t>Coordonnées géographiques des 9 sites.</w:t>
       </w:r>
@@ -75,7 +75,7 @@
           <w:b w:val="0"/>
           <w:i/>
         </w:rPr>
-        <w:t>Note : les effectifs sont connus (181 individus). Le rôle de Manosque et l'identité de Per restent liés au génotypage en cours — demande séparée.</w:t>
+        <w:t>Note : les effectifs sont connus (181 individus). Le rôle de Manosque et l'identité de Per dépendent du génotypage — demande séparée (metadata/index_hybride_andre.csv).</w:t>
       </w:r>
     </w:p>
     <w:p>
@@ -83,29 +83,16 @@
         <w:pStyle w:val="Heading1"/>
       </w:pPr>
       <w:r>
-        <w:t>2 — Séquençage (§3 du M&amp;M)</w:t>
+        <w:t>Réponses reçues — intégrées au M&amp;M</w:t>
       </w:r>
     </w:p>
     <w:p>
-      <w:pPr>
-        <w:pStyle w:val="ListBullet"/>
-      </w:pPr>
       <w:r>
         <w:rPr>
-          <w:b/>
+          <w:b w:val="0"/>
+          <w:i/>
         </w:rPr>
-        <w:t>Dates des trois runs MiSeq (durance1, durance2, durance3).</w:t>
-      </w:r>
-    </w:p>
-    <w:p>
-      <w:pPr>
-        <w:pStyle w:val="ListBullet"/>
-      </w:pPr>
-      <w:r>
-        <w:rPr>
-          <w:b/>
-        </w:rPr>
-        <w:t>Taux de spike-in PhiX.</w:t>
+        <w:t>Pour mémoire, ce qui est désormais réglé :</w:t>
       </w:r>
     </w:p>
     <w:p>
@@ -116,15 +103,7 @@
         <w:rPr>
           <w:b w:val="0"/>
         </w:rPr>
-        <w:t>Optionnel : nombre de cycles PCR et polymérase. Le M&amp;M cite actuellement Galan et al. (2016) pour les conditions d'amplification, ce qui suffit à la plupart des journaux ; ces valeurs ne sont nécessaires que si le journal exige les paramètres explicites.</w:t>
-      </w:r>
-    </w:p>
-    <w:p>
-      <w:pPr>
-        <w:pStyle w:val="Heading1"/>
-      </w:pPr>
-      <w:r>
-        <w:t>3 — Standard Zymo (§4 du M&amp;M)</w:t>
+        <w:t>Séquençage : MiSeq le 10 juillet 2017 (durance1), 5 octobre 2017 (durance2), 3 novembre 2017 (durance3) ; spike-in PhiX 10 %. Conditions de PCR citées via Galan et al. (2016).</w:t>
       </w:r>
     </w:p>
     <w:p>
@@ -135,34 +114,7 @@
         <w:rPr>
           <w:b w:val="0"/>
         </w:rPr>
-        <w:t>Référence catalogue du standard ZymoBIOMICS utilisé (D6300 ou D6305 ?).</w:t>
-      </w:r>
-    </w:p>
-    <w:p>
-      <w:r>
-        <w:rPr>
-          <w:b w:val="0"/>
-          <w:i w:val="0"/>
-          <w:color w:val="1F4E79"/>
-        </w:rPr>
-        <w:t>Le numéro de lot n'est plus nécessaire : la date de manipulation (2014-2015) est antérieure au lot ZRC190633 à partir duquel Zymo a changé 5 souches, ce qui fixe le jeu de souches de référence. Nous avons de plus vérifié que, sur la région V4 amplifiée, les séquences 16S des deux jeux de référence sont identiques pour les 8 espèces — la validation 8/8 des mocks est donc indépendante du lot.</w:t>
-      </w:r>
-    </w:p>
-    <w:p>
-      <w:pPr>
-        <w:pStyle w:val="Heading1"/>
-      </w:pPr>
-      <w:r>
-        <w:t>4 — Divergences draft / données : confirmation demandée</w:t>
-      </w:r>
-    </w:p>
-    <w:p>
-      <w:r>
-        <w:rPr>
-          <w:b w:val="0"/>
-          <w:i/>
-        </w:rPr>
-        <w:t>Trois points où le draft du manuscrit d'origine diffère du jeu Durance. Nous avons retenu les données Durance ; merci de confirmer.</w:t>
+        <w:t>Mock : ZymoBIOMICS Microbial Community Standard, cat. D6300. Numéro de lot non consigné mais non nécessaire (voir ci-dessous).</w:t>
       </w:r>
     </w:p>
     <w:p>
@@ -173,7 +125,7 @@
         <w:rPr>
           <w:b w:val="0"/>
         </w:rPr>
-        <w:t>Tissus : le draft mentionne une extraction sur branchie et midgut ; le jeu Durance comporte quatre tissus (nageoire caudale, branchie, midgut, hindgut).</w:t>
+        <w:t>Contrôles négatifs : 4 blancs d'extraction (un par tissu) + 8 témoins PCR, chacun dans les 3 runs (36 contrôles négatifs au total) — concordant entre le draft et les données.</w:t>
       </w:r>
     </w:p>
     <w:p>
@@ -184,18 +136,35 @@
         <w:rPr>
           <w:b w:val="0"/>
         </w:rPr>
-        <w:t>Runs : le draft décrit une procédure « dupliquée, et l'une séquencée deux fois » ; les données montrent trois runs des mêmes 768 librairies (triplicats techniques).</w:t>
+        <w:t>Divergences draft / données : tranchées en faveur des données, le draft ne portant que sur une partie du jeu (branchie et midgut). Le M&amp;M décrit le plan à quatre tissus, les trois runs des mêmes 768 librairies, et SILVA v138.2 via assignTaxonomy (DADA2).</w:t>
       </w:r>
     </w:p>
     <w:p>
       <w:pPr>
-        <w:pStyle w:val="ListBullet"/>
+        <w:pStyle w:val="Heading1"/>
       </w:pPr>
+      <w:r>
+        <w:t>Point d'attention — justification du lot Zymo</w:t>
+      </w:r>
+    </w:p>
+    <w:p>
       <w:r>
         <w:rPr>
           <w:b w:val="0"/>
+          <w:i w:val="0"/>
+          <w:color w:val="1F4E79"/>
         </w:rPr>
-        <w:t>Taxonomie : le draft cite SILVA v132 via le classifieur bayésien de QIIME 2 ; le pipeline Durance utilise SILVA v138.2 via assignTaxonomy (DADA2). Le M&amp;M décrit le pipeline réellement exécuté.</w:t>
+        <w:t>La date de séquençage retenue dans le M&amp;M est désormais 2017 (et non 2014-2015, qui correspond à la collecte). L'argument « antérieur au lot ZRC190633 » reste valide mais avec une marge plus courte : la documentation Zymo ne date pas explicitement le changement de souches ; un lot ZRC187325 est documenté comme contenant l'ancien mélange, ce qui situe la bascule vers 2018-2019, donc après novembre 2017.</w:t>
+      </w:r>
+    </w:p>
+    <w:p>
+      <w:r>
+        <w:rPr>
+          <w:b w:val="0"/>
+          <w:i w:val="0"/>
+          <w:color w:val="1F4E79"/>
+        </w:rPr>
+        <w:t>Cela reste sans conséquence sur la validation : nous avons vérifié que, sur la région V4 amplifiée, les séquences 16S des deux jeux de référence sont identiques pour les 8 espèces. La récupération 8/8 des taxons attendus est donc indépendante du lot.</w:t>
       </w:r>
     </w:p>
     <w:p>
@@ -212,11 +181,11 @@
           <w:b w:val="0"/>
           <w:i/>
         </w:rPr>
-        <w:t>• Génotypage / index hybride : demande séparée (metadata/index_hybride_andre.csv, 181 individus, 132 à renseigner).</w:t>
+        <w:t>• Génotypage / index hybride : demande séparée (181 individus, 132 à renseigner).</w:t>
         <w:br/>
-        <w:t>• Dépôt ENA des lectures brutes : pris en charge par JF Martin, à voir ultérieurement.</w:t>
+        <w:t>• Dépôt ENA des lectures brutes : pris en charge par JF Martin.</w:t>
         <w:br/>
-        <w:t>• Mode d'application de la raréfaction : décision d'analyse interne, pas une donnée de paillasse.</w:t>
+        <w:t>• Mode d'application de la raréfaction : décision d'analyse interne.</w:t>
       </w:r>
     </w:p>
     <w:sectPr>

</xml_diff>